<commit_message>
Sync CPUE agenda updates from jjm
</commit_message>
<xml_diff>
--- a/docs/SCW16-Paper-00.docx
+++ b/docs/SCW16-Paper-00.docx
@@ -41,36 +41,56 @@
         <w:pStyle w:val="FirstParagraph"/>
       </w:pPr>
       <w:r>
-        <w:t xml:space="preserve">Participants from IMARPE (Peru) and IFOP (Chile) met online and prepared this preliminary</w:t>
+        <w:t xml:space="preserve">This paper compiles the current draft benchmark agenda for the abundance-index sessions.</w:t>
       </w:r>
       <w:r>
         <w:t xml:space="preserve"> </w:t>
       </w:r>
       <w:r>
-        <w:t xml:space="preserve">draft schedule for acoustic survey evaluations during the benchmark workshop.</w:t>
-      </w:r>
-    </w:p>
-    <w:p>
-      <w:pPr>
-        <w:pStyle w:val="BodyText"/>
-      </w:pPr>
-      <w:r>
-        <w:t xml:space="preserve">Participants in this drafting committee included Criscely Lujan, Daniel Ramos, Mariano Gutiérrez,</w:t>
+        <w:t xml:space="preserve">It combines the acoustic-session schedule prepared by IMARPE and IFOP and the CPUE-session</w:t>
       </w:r>
       <w:r>
         <w:t xml:space="preserve"> </w:t>
       </w:r>
       <w:r>
-        <w:t xml:space="preserve">Ignacio Payá, Victor Catasti, and José Zenteno</w:t>
+        <w:t xml:space="preserve">agenda developed at the CPUE coordination meeting held on 14 April 2026.</w:t>
       </w:r>
     </w:p>
-    <w:bookmarkStart w:id="20" w:name="Xa7735ef9120df953958d1cbd45e2bfed775f89f"/>
     <w:p>
       <w:pPr>
+        <w:pStyle w:val="BodyText"/>
+      </w:pPr>
+      <w:r>
+        <w:t xml:space="preserve">Participants in the acoustic drafting committee included Criscely Lujan, Daniel Ramos,</w:t>
+      </w:r>
+      <w:r>
+        <w:t xml:space="preserve"> </w:t>
+      </w:r>
+      <w:r>
+        <w:t xml:space="preserve">Mariano Gutiérrez, Ignacio Payá, Victor Catasti, and José Zenteno.</w:t>
+      </w:r>
+    </w:p>
+    <w:p>
+      <w:pPr>
+        <w:pStyle w:val="BodyText"/>
+      </w:pPr>
+      <w:r>
+        <w:t xml:space="preserve">Participants in the CPUE coordination meeting included Criscely Lujan, Miriam Geronimo,</w:t>
+      </w:r>
+      <w:r>
+        <w:t xml:space="preserve"> </w:t>
+      </w:r>
+      <w:r>
+        <w:t xml:space="preserve">Erich Diaz, Ignacio Payá, José Zenteno, Sebastián Vásquez, and Niels Hintzen.</w:t>
+      </w:r>
+    </w:p>
+    <w:bookmarkStart w:id="20" w:name="X3c14e84487627fe36a19ff569c774c2d12c20b1"/>
+    <w:p>
+      <w:pPr>
         <w:pStyle w:val="Heading2"/>
       </w:pPr>
       <w:r>
-        <w:t xml:space="preserve">Preliminary Acoustic Session Agenda (day tbd)</w:t>
+        <w:t xml:space="preserve">Day 1. Preliminary Acoustic Session Agenda</w:t>
       </w:r>
     </w:p>
     <w:p>
@@ -618,6 +638,341 @@
       </w:tr>
     </w:tbl>
     <w:bookmarkEnd w:id="20"/>
+    <w:bookmarkStart w:id="21" w:name="day-2.-preliminary-cpue-session-agenda"/>
+    <w:p>
+      <w:pPr>
+        <w:pStyle w:val="Heading2"/>
+      </w:pPr>
+      <w:r>
+        <w:t xml:space="preserve">Day 2. Preliminary CPUE Session Agenda</w:t>
+      </w:r>
+    </w:p>
+    <w:p>
+      <w:pPr>
+        <w:pStyle w:val="FirstParagraph"/>
+      </w:pPr>
+      <w:r>
+        <w:t xml:space="preserve">The Day 2 CPUE session is currently organized as a thematic sequence. Exact time</w:t>
+      </w:r>
+      <w:r>
+        <w:t xml:space="preserve"> </w:t>
+      </w:r>
+      <w:r>
+        <w:t xml:space="preserve">allocations and presenters remain to be confirmed.</w:t>
+      </w:r>
+    </w:p>
+    <w:tbl>
+      <w:tblPr>
+        <w:tblStyle w:val="Table"/>
+        <w:tblW w:type="pct" w:w="5000"/>
+        <w:tblLayout w:type="fixed"/>
+        <w:tblLook w:firstRow="1" w:lastRow="0" w:firstColumn="0" w:lastColumn="0" w:noHBand="0" w:noVBand="0" w:val="0020"/>
+      </w:tblPr>
+      <w:tblGrid>
+        <w:gridCol w:w="2640"/>
+        <w:gridCol w:w="2640"/>
+        <w:gridCol w:w="2640"/>
+      </w:tblGrid>
+      <w:tr>
+        <w:trPr>
+          <w:tblHeader w:val="on"/>
+        </w:trPr>
+        <w:tc>
+          <w:tcPr/>
+          <w:p>
+            <w:pPr>
+              <w:pStyle w:val="Compact"/>
+            </w:pPr>
+            <w:r>
+              <w:t xml:space="preserve">Order</w:t>
+            </w:r>
+          </w:p>
+        </w:tc>
+        <w:tc>
+          <w:tcPr/>
+          <w:p>
+            <w:pPr>
+              <w:pStyle w:val="Compact"/>
+            </w:pPr>
+            <w:r>
+              <w:t xml:space="preserve">Topic</w:t>
+            </w:r>
+          </w:p>
+        </w:tc>
+        <w:tc>
+          <w:tcPr/>
+          <w:p>
+            <w:pPr>
+              <w:pStyle w:val="Compact"/>
+            </w:pPr>
+            <w:r>
+              <w:t xml:space="preserve">Notes</w:t>
+            </w:r>
+          </w:p>
+        </w:tc>
+      </w:tr>
+      <w:tr>
+        <w:tc>
+          <w:tcPr/>
+          <w:p>
+            <w:pPr>
+              <w:pStyle w:val="Compact"/>
+            </w:pPr>
+            <w:r>
+              <w:t xml:space="preserve">1</w:t>
+            </w:r>
+          </w:p>
+        </w:tc>
+        <w:tc>
+          <w:tcPr/>
+          <w:p>
+            <w:pPr>
+              <w:pStyle w:val="Compact"/>
+            </w:pPr>
+            <w:r>
+              <w:t xml:space="preserve">Metadata by fleet and country</w:t>
+            </w:r>
+          </w:p>
+        </w:tc>
+        <w:tc>
+          <w:tcPr/>
+          <w:p>
+            <w:pPr>
+              <w:pStyle w:val="Compact"/>
+            </w:pPr>
+            <w:r>
+              <w:t xml:space="preserve">Review fleet definitions, spatial coverage, observation level, and index construction by country and fishery.</w:t>
+            </w:r>
+          </w:p>
+        </w:tc>
+      </w:tr>
+      <w:tr>
+        <w:tc>
+          <w:tcPr/>
+          <w:p>
+            <w:pPr>
+              <w:pStyle w:val="Compact"/>
+            </w:pPr>
+            <w:r>
+              <w:t xml:space="preserve">2</w:t>
+            </w:r>
+          </w:p>
+        </w:tc>
+        <w:tc>
+          <w:tcPr/>
+          <w:p>
+            <w:pPr>
+              <w:pStyle w:val="Compact"/>
+            </w:pPr>
+            <w:r>
+              <w:t xml:space="preserve">Methods by fleet and country</w:t>
+            </w:r>
+          </w:p>
+        </w:tc>
+        <w:tc>
+          <w:tcPr/>
+          <w:p>
+            <w:pPr>
+              <w:pStyle w:val="Compact"/>
+            </w:pPr>
+            <w:r>
+              <w:t xml:space="preserve">Compare GLM, spatio-temporal models, GLMMs with spatio-temporal random effects, and latitude-longitude smoothing approaches.</w:t>
+            </w:r>
+          </w:p>
+        </w:tc>
+      </w:tr>
+      <w:tr>
+        <w:tc>
+          <w:tcPr/>
+          <w:p>
+            <w:pPr>
+              <w:pStyle w:val="Compact"/>
+            </w:pPr>
+            <w:r>
+              <w:t xml:space="preserve">3</w:t>
+            </w:r>
+          </w:p>
+        </w:tc>
+        <w:tc>
+          <w:tcPr/>
+          <w:p>
+            <w:pPr>
+              <w:pStyle w:val="Compact"/>
+            </w:pPr>
+            <w:r>
+              <w:t xml:space="preserve">Comparative analysis and parsimony across candidate indices</w:t>
+            </w:r>
+          </w:p>
+        </w:tc>
+        <w:tc>
+          <w:tcPr/>
+          <w:p>
+            <w:pPr>
+              <w:pStyle w:val="Compact"/>
+            </w:pPr>
+            <w:r>
+              <w:t xml:space="preserve">Evaluate traditional GLM, spatio-temporal, and environmentally informed approaches and identify the most suitable benchmark candidates.</w:t>
+            </w:r>
+          </w:p>
+        </w:tc>
+      </w:tr>
+      <w:tr>
+        <w:tc>
+          <w:tcPr/>
+          <w:p>
+            <w:pPr>
+              <w:pStyle w:val="Compact"/>
+            </w:pPr>
+            <w:r>
+              <w:t xml:space="preserve">4</w:t>
+            </w:r>
+          </w:p>
+        </w:tc>
+        <w:tc>
+          <w:tcPr/>
+          <w:p>
+            <w:pPr>
+              <w:pStyle w:val="Compact"/>
+            </w:pPr>
+            <w:r>
+              <w:t xml:space="preserve">Effort-creep review and decision for stock assessment use</w:t>
+            </w:r>
+          </w:p>
+        </w:tc>
+        <w:tc>
+          <w:tcPr/>
+          <w:p>
+            <w:pPr>
+              <w:pStyle w:val="Compact"/>
+            </w:pPr>
+            <w:r>
+              <w:t xml:space="preserve">Revisit current effort-creep assumptions and consider whether revised treatment is needed for benchmark runs.</w:t>
+            </w:r>
+          </w:p>
+        </w:tc>
+      </w:tr>
+      <w:tr>
+        <w:tc>
+          <w:tcPr/>
+          <w:p>
+            <w:pPr>
+              <w:pStyle w:val="Compact"/>
+            </w:pPr>
+            <w:r>
+              <w:t xml:space="preserve">5</w:t>
+            </w:r>
+          </w:p>
+        </w:tc>
+        <w:tc>
+          <w:tcPr/>
+          <w:p>
+            <w:pPr>
+              <w:pStyle w:val="Compact"/>
+            </w:pPr>
+            <w:r>
+              <w:t xml:space="preserve">Catchability-availability blocks by abundance index</w:t>
+            </w:r>
+          </w:p>
+        </w:tc>
+        <w:tc>
+          <w:tcPr/>
+          <w:p>
+            <w:pPr>
+              <w:pStyle w:val="Compact"/>
+            </w:pPr>
+            <w:r>
+              <w:t xml:space="preserve">Review evidence for temporal or spatial changes in availability, including possible El Niño effects and implications for</w:t>
+            </w:r>
+            <w:r>
+              <w:t xml:space="preserve"> </w:t>
+            </w:r>
+            <w:r>
+              <w:rPr>
+                <w:rStyle w:val="VerbatimChar"/>
+              </w:rPr>
+              <w:t xml:space="preserve">q</w:t>
+            </w:r>
+            <w:r>
+              <w:t xml:space="preserve"> </w:t>
+            </w:r>
+            <w:r>
+              <w:t xml:space="preserve">blocks.</w:t>
+            </w:r>
+          </w:p>
+        </w:tc>
+      </w:tr>
+      <w:tr>
+        <w:tc>
+          <w:tcPr/>
+          <w:p>
+            <w:pPr>
+              <w:pStyle w:val="Compact"/>
+            </w:pPr>
+            <w:r>
+              <w:t xml:space="preserve">6</w:t>
+            </w:r>
+          </w:p>
+        </w:tc>
+        <w:tc>
+          <w:tcPr/>
+          <w:p>
+            <w:pPr>
+              <w:pStyle w:val="Compact"/>
+            </w:pPr>
+            <w:r>
+              <w:t xml:space="preserve">CPUE weighting factors for stock assessment</w:t>
+            </w:r>
+          </w:p>
+        </w:tc>
+        <w:tc>
+          <w:tcPr/>
+          <w:p>
+            <w:pPr>
+              <w:pStyle w:val="Compact"/>
+            </w:pPr>
+            <w:r>
+              <w:t xml:space="preserve">Discuss weighting choices and how they affect assessment fits and benchmark comparisons.</w:t>
+            </w:r>
+          </w:p>
+        </w:tc>
+      </w:tr>
+      <w:tr>
+        <w:tc>
+          <w:tcPr/>
+          <w:p>
+            <w:pPr>
+              <w:pStyle w:val="Compact"/>
+            </w:pPr>
+            <w:r>
+              <w:t xml:space="preserve">7</w:t>
+            </w:r>
+          </w:p>
+        </w:tc>
+        <w:tc>
+          <w:tcPr/>
+          <w:p>
+            <w:pPr>
+              <w:pStyle w:val="Compact"/>
+            </w:pPr>
+            <w:r>
+              <w:t xml:space="preserve">Separate versus combined index products for HCR use</w:t>
+            </w:r>
+          </w:p>
+        </w:tc>
+        <w:tc>
+          <w:tcPr/>
+          <w:p>
+            <w:pPr>
+              <w:pStyle w:val="Compact"/>
+            </w:pPr>
+            <w:r>
+              <w:t xml:space="preserve">Consider whether the benchmark should retain separate series or define a combined CPUE product for OM conditioning and MP inputs.</w:t>
+            </w:r>
+          </w:p>
+        </w:tc>
+      </w:tr>
+    </w:tbl>
+    <w:bookmarkEnd w:id="21"/>
     <w:sectPr>
       <w:footnotePr>
         <w:numRestart w:val="eachSect"/>

</xml_diff>